<commit_message>
Add portfolio site content and assets
Add complete portfolio site files: README, case pages (dkg-logistics, atrio), CSS and JS (css/style.css, js/main.js), favicon and OG images, and numerous asset/ and files/ copies (including portfolio ZIPs). Update resume files (assets/resume.pdf, .docx) and modify index.html. Provides content, images, and examples for two case studies and local preview setup.
</commit_message>
<xml_diff>
--- a/assets/resume.pdf.docx
+++ b/assets/resume.pdf.docx
@@ -50,23 +50,7 @@
             <w:sz w:val="20"/>
             <w:szCs w:val="20"/>
           </w:rPr>
-          <w:t>mosorm</w:t>
-        </w:r>
-        <w:r>
-          <w:rPr>
-            <w:rStyle w:val="Hyperlink"/>
-            <w:sz w:val="20"/>
-            <w:szCs w:val="20"/>
-          </w:rPr>
-          <w:t>@</w:t>
-        </w:r>
-        <w:r>
-          <w:rPr>
-            <w:rStyle w:val="Hyperlink"/>
-            <w:sz w:val="20"/>
-            <w:szCs w:val="20"/>
-          </w:rPr>
-          <w:t>gmail.com</w:t>
+          <w:t>mosorm@gmail.com</w:t>
         </w:r>
       </w:hyperlink>
       <w:r>
@@ -126,7 +110,23 @@
             <w:sz w:val="20"/>
             <w:szCs w:val="20"/>
           </w:rPr>
-          <w:t>www.linkedin.com/in/mateusz-mosór-2b099423b</w:t>
+          <w:t>www.linkedin.com/in/</w:t>
+        </w:r>
+        <w:r>
+          <w:rPr>
+            <w:rStyle w:val="Hyperlink"/>
+            <w:sz w:val="20"/>
+            <w:szCs w:val="20"/>
+          </w:rPr>
+          <w:t>m</w:t>
+        </w:r>
+        <w:r>
+          <w:rPr>
+            <w:rStyle w:val="Hyperlink"/>
+            <w:sz w:val="20"/>
+            <w:szCs w:val="20"/>
+          </w:rPr>
+          <w:t>ateusz-mosór</w:t>
         </w:r>
       </w:hyperlink>
     </w:p>
@@ -253,15 +253,7 @@
         <w:spacing w:after="40"/>
       </w:pPr>
       <w:r>
-        <w:t>Deployed as a public Streamlit app — office-occupancy-</w:t>
-      </w:r>
-      <w:proofErr w:type="spellStart"/>
-      <w:r>
-        <w:t>app.streamlit.app</w:t>
-      </w:r>
-      <w:proofErr w:type="spellEnd"/>
-      <w:r>
-        <w:t xml:space="preserve"> — with source on GitHub.</w:t>
+        <w:t>Deployed as a public Streamlit app — office-occupancy-app.streamlit.app — with source on GitHub.</w:t>
       </w:r>
     </w:p>
     <w:p>
@@ -1093,10 +1085,7 @@
         <w:t>Git · WMS · Champion vs. Challenger evaluation · Feature engineering · Heuristic optimisation · RAG</w:t>
       </w:r>
       <w:r>
-        <w:t xml:space="preserve"> ·</w:t>
-      </w:r>
-      <w:r>
-        <w:t xml:space="preserve"> Cursor</w:t>
+        <w:t xml:space="preserve"> · Cursor</w:t>
       </w:r>
     </w:p>
     <w:p>

</xml_diff>